<commit_message>
fix: align issuer signature block to visual left and standardize closing sentence
</commit_message>
<xml_diff>
--- a/backend/Templates/عرض سعر شركة اتريم.docx
+++ b/backend/Templates/عرض سعر شركة اتريم.docx
@@ -956,8 +956,14 @@
           <w:rtl/>
           <w:lang w:bidi="ar-QA"/>
         </w:rPr>
-        <w:t>بل</w:t>
+        <w:t>تفضلوا بقبول فائق الاحترام والتقدير ،،،،،</w:t>
       </w:r>
+    </w:p>
+    <w:p>
+      <w:pPr>
+        <w:jc w:val="left"/>
+        <w:spacing w:before="0" w:after="0" w:line="240" w:lineRule="auto"/>
+      </w:pPr>
       <w:r>
         <w:rPr>
           <w:rFonts w:hint="cs"/>
@@ -968,20 +974,17 @@
           <w:rtl/>
           <w:lang w:bidi="ar-QA"/>
         </w:rPr>
-        <w:t xml:space="preserve"> بقبول فائق الاحترام والتقدير ،،،،،</w:t>
+        <w:t>مدير تطوير الأعمال والمبيعات</w:t>
       </w:r>
     </w:p>
     <w:p>
       <w:pPr>
-        <w:tabs>
-          <w:tab w:val="left" w:pos="1727"/>
-          <w:tab w:val="center" w:pos="4873"/>
-          <w:tab w:val="left" w:pos="4986"/>
-        </w:tabs>
-        <w:bidi/>
-        <w:ind w:left="720"/>
-        <w:jc w:val="center"/>
-        <w:rPr>
+        <w:jc w:val="left"/>
+        <w:spacing w:before="0" w:after="0" w:line="240" w:lineRule="auto"/>
+      </w:pPr>
+      <w:r>
+        <w:rPr>
+          <w:rFonts w:hint="cs"/>
           <w:b/>
           <w:bCs/>
           <w:sz w:val="28"/>
@@ -989,149 +992,7 @@
           <w:rtl/>
           <w:lang w:bidi="ar-QA"/>
         </w:rPr>
-      </w:pPr>
-      <w:r>
-        <w:rPr>
-          <w:rFonts w:hint="cs"/>
-          <w:b/>
-          <w:bCs/>
-          <w:sz w:val="28"/>
-          <w:szCs w:val="28"/>
-          <w:rtl/>
-          <w:lang w:bidi="ar-QA"/>
-        </w:rPr>
-        <w:t xml:space="preserve">                                                                            </w:t>
-      </w:r>
-      <w:r>
-        <w:rPr>
-          <w:rFonts w:hint="cs"/>
-          <w:b/>
-          <w:bCs/>
-          <w:sz w:val="28"/>
-          <w:szCs w:val="28"/>
-          <w:rtl/>
-          <w:lang w:bidi="ar-QA"/>
-        </w:rPr>
-        <w:t xml:space="preserve">مدير </w:t>
-      </w:r>
-      <w:r>
-        <w:rPr>
-          <w:rFonts w:hint="cs"/>
-          <w:b/>
-          <w:bCs/>
-          <w:sz w:val="28"/>
-          <w:szCs w:val="28"/>
-          <w:rtl/>
-          <w:lang w:bidi="ar-QA"/>
-        </w:rPr>
-        <w:t>تطوير الاعمال والمبيعات</w:t>
-      </w:r>
-      <w:r>
-        <w:rPr>
-          <w:rFonts w:hint="cs"/>
-          <w:b/>
-          <w:bCs/>
-          <w:sz w:val="28"/>
-          <w:szCs w:val="28"/>
-          <w:rtl/>
-          <w:lang w:bidi="ar-QA"/>
-        </w:rPr>
-        <w:t xml:space="preserve"> </w:t>
-      </w:r>
-      <w:r>
-        <w:rPr>
-          <w:rFonts w:hint="cs"/>
-          <w:b/>
-          <w:bCs/>
-          <w:sz w:val="28"/>
-          <w:szCs w:val="28"/>
-          <w:rtl/>
-          <w:lang w:bidi="ar-QA"/>
-        </w:rPr>
-        <w:t xml:space="preserve">                 </w:t>
-      </w:r>
-      <w:r>
-        <w:rPr>
-          <w:rFonts w:hint="cs"/>
-          <w:b/>
-          <w:bCs/>
-          <w:sz w:val="28"/>
-          <w:szCs w:val="28"/>
-          <w:rtl/>
-          <w:lang w:bidi="ar-QA"/>
-        </w:rPr>
-        <w:t xml:space="preserve">                 </w:t>
-      </w:r>
-      <w:r>
-        <w:rPr>
-          <w:b/>
-          <w:bCs/>
-          <w:sz w:val="28"/>
-          <w:szCs w:val="28"/>
-          <w:rtl/>
-          <w:lang w:bidi="ar-QA"/>
-        </w:rPr>
-        <w:tab/>
-      </w:r>
-      <w:r>
-        <w:rPr>
-          <w:rFonts w:hint="cs"/>
-          <w:b/>
-          <w:bCs/>
-          <w:sz w:val="28"/>
-          <w:szCs w:val="28"/>
-          <w:rtl/>
-          <w:lang w:bidi="ar-QA"/>
-        </w:rPr>
-        <w:t xml:space="preserve">                                                                </w:t>
-      </w:r>
-      <w:r>
-        <w:rPr>
-          <w:rFonts w:hint="cs"/>
-          <w:b/>
-          <w:bCs/>
-          <w:sz w:val="28"/>
-          <w:szCs w:val="28"/>
-          <w:rtl/>
-          <w:lang w:bidi="ar-QA"/>
-        </w:rPr>
-        <w:t xml:space="preserve">    </w:t>
-      </w:r>
-      <w:r>
-        <w:rPr>
-          <w:rFonts w:hint="cs"/>
-          <w:b/>
-          <w:bCs/>
-          <w:sz w:val="28"/>
-          <w:szCs w:val="28"/>
-          <w:rtl/>
-          <w:lang w:bidi="ar-QA"/>
-        </w:rPr>
-        <w:t>م / اشرف الشربيني</w:t>
-      </w:r>
-      <w:r>
-        <w:rPr>
-          <w:rFonts w:hint="cs"/>
-          <w:b/>
-          <w:bCs/>
-          <w:sz w:val="28"/>
-          <w:szCs w:val="28"/>
-          <w:rtl/>
-          <w:lang w:bidi="ar-QA"/>
-        </w:rPr>
-        <w:t xml:space="preserve"> </w:t>
-      </w:r>
-      <w:r>
-        <w:rPr>
-          <w:rFonts w:hint="cs"/>
-          <w:b/>
-          <w:bCs/>
-          <w:sz w:val="28"/>
-          <w:szCs w:val="28"/>
-          <w:rtl/>
-          <w:lang w:bidi="ar-QA"/>
-        </w:rPr>
-        <w:t xml:space="preserve"> </w:t>
+        <w:t>م / أشرف الشربيني</w:t>
       </w:r>
     </w:p>
     <w:sectPr>

</xml_diff>